<commit_message>
docs: adicionar documento de telas completo em .doc e .docx com prints e explicacoes de todas as 26 telas do sistema
</commit_message>
<xml_diff>
--- a/Zelo_Documento_Telas_e_Funcionalidades.docx
+++ b/Zelo_Documento_Telas_e_Funcionalidades.docx
@@ -6676,6 +6676,552 @@
           <w:p>
             <w:r>
               <w:t>Critério de Sucesso WCAG 2.2 - 1.4.4 (Redimensionamento de Texto): Permite que o texto seja ampliado em até 200% sem tecnologia assistiva e sem perda de conteúdo ou funcionalidade.</w:t>
+            </w:r>
+          </w:p>
+        </w:tc>
+      </w:tr>
+    </w:tbl>
+    <w:p>
+      <w:pPr>
+        <w:spacing w:after="280"/>
+      </w:pPr>
+    </w:p>
+    <w:p>
+      <w:pPr>
+        <w:pStyle w:val="Heading2"/>
+      </w:pPr>
+      <w:r>
+        <w:t>Tela 25: Catálogo Institucional de Fármacos e Protocolos de Dor (RENAME / Erasto Gaertner)</w:t>
+      </w:r>
+    </w:p>
+    <w:p>
+      <w:pPr>
+        <w:spacing w:before="160" w:after="80"/>
+        <w:jc w:val="center"/>
+      </w:pPr>
+      <w:r>
+        <w:drawing>
+          <wp:inline xmlns:a="http://schemas.openxmlformats.org/drawingml/2006/main" xmlns:pic="http://schemas.openxmlformats.org/drawingml/2006/picture">
+            <wp:extent cx="5669280" cy="2031861"/>
+            <wp:docPr id="25" name="Picture 25"/>
+            <wp:cNvGraphicFramePr>
+              <a:graphicFrameLocks noChangeAspect="1"/>
+            </wp:cNvGraphicFramePr>
+            <a:graphic>
+              <a:graphicData uri="http://schemas.openxmlformats.org/drawingml/2006/picture">
+                <pic:pic>
+                  <pic:nvPicPr>
+                    <pic:cNvPr id="0" name="25_catalogo_medicamentos.png"/>
+                    <pic:cNvPicPr/>
+                  </pic:nvPicPr>
+                  <pic:blipFill>
+                    <a:blip r:embed="rId35"/>
+                    <a:stretch>
+                      <a:fillRect/>
+                    </a:stretch>
+                  </pic:blipFill>
+                  <pic:spPr>
+                    <a:xfrm>
+                      <a:off x="0" y="0"/>
+                      <a:ext cx="5669280" cy="2031861"/>
+                    </a:xfrm>
+                    <a:prstGeom prst="rect"/>
+                  </pic:spPr>
+                </pic:pic>
+              </a:graphicData>
+            </a:graphic>
+          </wp:inline>
+        </w:drawing>
+      </w:r>
+    </w:p>
+    <w:p>
+      <w:pPr>
+        <w:spacing w:after="240"/>
+        <w:jc w:val="center"/>
+      </w:pPr>
+      <w:r>
+        <w:rPr>
+          <w:i/>
+          <w:color w:val="64748B"/>
+          <w:sz w:val="17"/>
+        </w:rPr>
+        <w:t>Figura 25 · Catálogo Institucional de Fármacos e Protocolos de Dor (RENAME / Erasto Gaertner) (Captura do Sistema Real em Execução)</w:t>
+      </w:r>
+    </w:p>
+    <w:tbl>
+      <w:tblPr>
+        <w:tblW w:type="auto" w:w="0"/>
+        <w:jc w:val="center"/>
+        <w:tblLook w:firstColumn="1" w:firstRow="1" w:lastColumn="0" w:lastRow="0" w:noHBand="0" w:noVBand="1" w:val="04A0"/>
+      </w:tblPr>
+      <w:tblGrid>
+        <w:gridCol w:w="4709"/>
+        <w:gridCol w:w="4709"/>
+      </w:tblGrid>
+      <w:tr>
+        <w:tc>
+          <w:tcPr>
+            <w:tcW w:type="dxa" w:w="2592"/>
+            <w:shd w:fill="F4F8F7"/>
+            <w:tcMar>
+              <w:top w:w="60" w:type="dxa"/>
+              <w:bottom w:w="60" w:type="dxa"/>
+              <w:left w:w="100" w:type="dxa"/>
+              <w:right w:w="100" w:type="dxa"/>
+            </w:tcMar>
+          </w:tcPr>
+          <w:p>
+            <w:r>
+              <w:rPr>
+                <w:b/>
+              </w:rPr>
+              <w:t>Módulo e Contexto:</w:t>
+            </w:r>
+          </w:p>
+        </w:tc>
+        <w:tc>
+          <w:tcPr>
+            <w:tcW w:type="dxa" w:w="6768"/>
+            <w:shd w:fill="FFFFFF"/>
+            <w:tcMar>
+              <w:top w:w="60" w:type="dxa"/>
+              <w:bottom w:w="60" w:type="dxa"/>
+              <w:left w:w="100" w:type="dxa"/>
+              <w:right w:w="100" w:type="dxa"/>
+            </w:tcMar>
+          </w:tcPr>
+          <w:p>
+            <w:r>
+              <w:t>Desktop / Farmacologia Institucional</w:t>
+            </w:r>
+          </w:p>
+        </w:tc>
+      </w:tr>
+      <w:tr>
+        <w:tc>
+          <w:tcPr>
+            <w:tcW w:type="dxa" w:w="4709"/>
+            <w:shd w:fill="F4F8F7"/>
+            <w:tcMar>
+              <w:top w:w="60" w:type="dxa"/>
+              <w:bottom w:w="60" w:type="dxa"/>
+              <w:left w:w="100" w:type="dxa"/>
+              <w:right w:w="100" w:type="dxa"/>
+            </w:tcMar>
+          </w:tcPr>
+          <w:p>
+            <w:r>
+              <w:rPr>
+                <w:b/>
+              </w:rPr>
+              <w:t>Objetivo Clínico:</w:t>
+            </w:r>
+          </w:p>
+        </w:tc>
+        <w:tc>
+          <w:tcPr>
+            <w:tcW w:type="dxa" w:w="4709"/>
+            <w:shd w:fill="FFFFFF"/>
+            <w:tcMar>
+              <w:top w:w="60" w:type="dxa"/>
+              <w:bottom w:w="60" w:type="dxa"/>
+              <w:left w:w="100" w:type="dxa"/>
+              <w:right w:w="100" w:type="dxa"/>
+            </w:tcMar>
+          </w:tcPr>
+          <w:p>
+            <w:r>
+              <w:t>Padronizar o arsenal terapêutico para cuidados paliativos domiciliares, organizando princípios ativos, doses usuais e identificando claramente as Doses de Resgate SOS para alívio rápido da dor.</w:t>
+            </w:r>
+          </w:p>
+        </w:tc>
+      </w:tr>
+      <w:tr>
+        <w:tc>
+          <w:tcPr>
+            <w:tcW w:type="dxa" w:w="4709"/>
+            <w:shd w:fill="F4F8F7"/>
+            <w:tcMar>
+              <w:top w:w="60" w:type="dxa"/>
+              <w:bottom w:w="60" w:type="dxa"/>
+              <w:left w:w="100" w:type="dxa"/>
+              <w:right w:w="100" w:type="dxa"/>
+            </w:tcMar>
+          </w:tcPr>
+          <w:p>
+            <w:r>
+              <w:rPr>
+                <w:b/>
+              </w:rPr>
+              <w:t>Funcionalidades Principais:</w:t>
+            </w:r>
+          </w:p>
+        </w:tc>
+        <w:tc>
+          <w:tcPr>
+            <w:tcW w:type="dxa" w:w="4709"/>
+            <w:shd w:fill="FFFFFF"/>
+            <w:tcMar>
+              <w:top w:w="60" w:type="dxa"/>
+              <w:bottom w:w="60" w:type="dxa"/>
+              <w:left w:w="100" w:type="dxa"/>
+              <w:right w:w="100" w:type="dxa"/>
+            </w:tcMar>
+          </w:tcPr>
+          <w:p>
+            <w:pPr>
+              <w:spacing w:after="40"/>
+            </w:pPr>
+            <w:r>
+              <w:t>• Cards farmacológicos padronizados: Bisacodil, Clonazepam, Dexametasona, Morfina, Paracetamol, etc.</w:t>
+            </w:r>
+          </w:p>
+          <w:p>
+            <w:pPr>
+              <w:spacing w:after="40"/>
+            </w:pPr>
+            <w:r>
+              <w:t>• Identificação de vias de administração seguras no domicílio: Oral (VO), Subcutânea (SC) e Transdérmica (TD).</w:t>
+            </w:r>
+          </w:p>
+          <w:p>
+            <w:pPr>
+              <w:spacing w:after="40"/>
+            </w:pPr>
+            <w:r>
+              <w:t>• Badge destacado '⚡ Resgate SOS' para medicamentos autorizados em crises de dor aguda.</w:t>
+            </w:r>
+          </w:p>
+          <w:p>
+            <w:pPr>
+              <w:spacing w:after="40"/>
+            </w:pPr>
+            <w:r>
+              <w:t>• Filtros ágeis por sintoma-alvo (Dor, Constipação, Náusea, Ansiedade/Insônia) e busca instantânea.</w:t>
+            </w:r>
+          </w:p>
+          <w:p>
+            <w:pPr>
+              <w:spacing w:after="40"/>
+            </w:pPr>
+            <w:r>
+              <w:t>• Caixa de Precauções &amp; Orientações Clínicas com alertas médicos essenciais (ex.: uso compulsório de laxativo com opioides).</w:t>
+            </w:r>
+          </w:p>
+          <w:p>
+            <w:pPr>
+              <w:spacing w:after="40"/>
+            </w:pPr>
+            <w:r>
+              <w:t>• Botão de cadastro administrativo para inclusão de novas moléculas na base institucional.</w:t>
+            </w:r>
+          </w:p>
+        </w:tc>
+      </w:tr>
+      <w:tr>
+        <w:tc>
+          <w:tcPr>
+            <w:tcW w:type="dxa" w:w="4709"/>
+            <w:shd w:fill="F4F8F7"/>
+            <w:tcMar>
+              <w:top w:w="60" w:type="dxa"/>
+              <w:bottom w:w="60" w:type="dxa"/>
+              <w:left w:w="100" w:type="dxa"/>
+              <w:right w:w="100" w:type="dxa"/>
+            </w:tcMar>
+          </w:tcPr>
+          <w:p>
+            <w:r>
+              <w:rPr>
+                <w:b/>
+              </w:rPr>
+              <w:t>Fundamentos de IHC e Acessibilidade:</w:t>
+            </w:r>
+          </w:p>
+        </w:tc>
+        <w:tc>
+          <w:tcPr>
+            <w:tcW w:type="dxa" w:w="4709"/>
+            <w:shd w:fill="FFFFFF"/>
+            <w:tcMar>
+              <w:top w:w="60" w:type="dxa"/>
+              <w:bottom w:w="60" w:type="dxa"/>
+              <w:left w:w="100" w:type="dxa"/>
+              <w:right w:w="100" w:type="dxa"/>
+            </w:tcMar>
+          </w:tcPr>
+          <w:p>
+            <w:r>
+              <w:t>Heurística #5 de Nielsen (Prevenção de erros): A visualização padronizada de doses e frequências previne erros graves de posologia em fármacos potentes (opioides e adjuvantes). Tipografia numérica tabular (tabular-nums) para precisão decimal.</w:t>
+            </w:r>
+          </w:p>
+        </w:tc>
+      </w:tr>
+    </w:tbl>
+    <w:p>
+      <w:pPr>
+        <w:spacing w:after="280"/>
+      </w:pPr>
+    </w:p>
+    <w:p>
+      <w:pPr>
+        <w:pStyle w:val="Heading2"/>
+      </w:pPr>
+      <w:r>
+        <w:t>Tela 26: Curva de Tendência Temporal ESAS e Painel de Variação Clínica Recente (Delta)</w:t>
+      </w:r>
+    </w:p>
+    <w:p>
+      <w:pPr>
+        <w:spacing w:before="160" w:after="80"/>
+        <w:jc w:val="center"/>
+      </w:pPr>
+      <w:r>
+        <w:drawing>
+          <wp:inline xmlns:a="http://schemas.openxmlformats.org/drawingml/2006/main" xmlns:pic="http://schemas.openxmlformats.org/drawingml/2006/picture">
+            <wp:extent cx="5669280" cy="1179255"/>
+            <wp:docPr id="26" name="Picture 26"/>
+            <wp:cNvGraphicFramePr>
+              <a:graphicFrameLocks noChangeAspect="1"/>
+            </wp:cNvGraphicFramePr>
+            <a:graphic>
+              <a:graphicData uri="http://schemas.openxmlformats.org/drawingml/2006/picture">
+                <pic:pic>
+                  <pic:nvPicPr>
+                    <pic:cNvPr id="0" name="26_tendencia_temporal_esas.png"/>
+                    <pic:cNvPicPr/>
+                  </pic:nvPicPr>
+                  <pic:blipFill>
+                    <a:blip r:embed="rId36"/>
+                    <a:stretch>
+                      <a:fillRect/>
+                    </a:stretch>
+                  </pic:blipFill>
+                  <pic:spPr>
+                    <a:xfrm>
+                      <a:off x="0" y="0"/>
+                      <a:ext cx="5669280" cy="1179255"/>
+                    </a:xfrm>
+                    <a:prstGeom prst="rect"/>
+                  </pic:spPr>
+                </pic:pic>
+              </a:graphicData>
+            </a:graphic>
+          </wp:inline>
+        </w:drawing>
+      </w:r>
+    </w:p>
+    <w:p>
+      <w:pPr>
+        <w:spacing w:after="240"/>
+        <w:jc w:val="center"/>
+      </w:pPr>
+      <w:r>
+        <w:rPr>
+          <w:i/>
+          <w:color w:val="64748B"/>
+          <w:sz w:val="17"/>
+        </w:rPr>
+        <w:t>Figura 26 · Curva de Tendência Temporal ESAS e Painel de Variação Clínica Recente (Delta) (Captura do Sistema Real em Execução)</w:t>
+      </w:r>
+    </w:p>
+    <w:tbl>
+      <w:tblPr>
+        <w:tblW w:type="auto" w:w="0"/>
+        <w:jc w:val="center"/>
+        <w:tblLook w:firstColumn="1" w:firstRow="1" w:lastColumn="0" w:lastRow="0" w:noHBand="0" w:noVBand="1" w:val="04A0"/>
+      </w:tblPr>
+      <w:tblGrid>
+        <w:gridCol w:w="4709"/>
+        <w:gridCol w:w="4709"/>
+      </w:tblGrid>
+      <w:tr>
+        <w:tc>
+          <w:tcPr>
+            <w:tcW w:type="dxa" w:w="2592"/>
+            <w:shd w:fill="F4F8F7"/>
+            <w:tcMar>
+              <w:top w:w="60" w:type="dxa"/>
+              <w:bottom w:w="60" w:type="dxa"/>
+              <w:left w:w="100" w:type="dxa"/>
+              <w:right w:w="100" w:type="dxa"/>
+            </w:tcMar>
+          </w:tcPr>
+          <w:p>
+            <w:r>
+              <w:rPr>
+                <w:b/>
+              </w:rPr>
+              <w:t>Módulo e Contexto:</w:t>
+            </w:r>
+          </w:p>
+        </w:tc>
+        <w:tc>
+          <w:tcPr>
+            <w:tcW w:type="dxa" w:w="6768"/>
+            <w:shd w:fill="FFFFFF"/>
+            <w:tcMar>
+              <w:top w:w="60" w:type="dxa"/>
+              <w:bottom w:w="60" w:type="dxa"/>
+              <w:left w:w="100" w:type="dxa"/>
+              <w:right w:w="100" w:type="dxa"/>
+            </w:tcMar>
+          </w:tcPr>
+          <w:p>
+            <w:r>
+              <w:t>Desktop / Prontuário Avançado</w:t>
+            </w:r>
+          </w:p>
+        </w:tc>
+      </w:tr>
+      <w:tr>
+        <w:tc>
+          <w:tcPr>
+            <w:tcW w:type="dxa" w:w="4709"/>
+            <w:shd w:fill="F4F8F7"/>
+            <w:tcMar>
+              <w:top w:w="60" w:type="dxa"/>
+              <w:bottom w:w="60" w:type="dxa"/>
+              <w:left w:w="100" w:type="dxa"/>
+              <w:right w:w="100" w:type="dxa"/>
+            </w:tcMar>
+          </w:tcPr>
+          <w:p>
+            <w:r>
+              <w:rPr>
+                <w:b/>
+              </w:rPr>
+              <w:t>Objetivo Clínico:</w:t>
+            </w:r>
+          </w:p>
+        </w:tc>
+        <w:tc>
+          <w:tcPr>
+            <w:tcW w:type="dxa" w:w="4709"/>
+            <w:shd w:fill="FFFFFF"/>
+            <w:tcMar>
+              <w:top w:w="60" w:type="dxa"/>
+              <w:bottom w:w="60" w:type="dxa"/>
+              <w:left w:w="100" w:type="dxa"/>
+              <w:right w:w="100" w:type="dxa"/>
+            </w:tcMar>
+          </w:tcPr>
+          <w:p>
+            <w:r>
+              <w:t>Visualização longitudinal gráfica da evolução dos sintomas ao longo do tempo, correlacionando o ajuste de analgesia com a resposta terapêutica através do cálculo de variação (delta).</w:t>
+            </w:r>
+          </w:p>
+        </w:tc>
+      </w:tr>
+      <w:tr>
+        <w:tc>
+          <w:tcPr>
+            <w:tcW w:type="dxa" w:w="4709"/>
+            <w:shd w:fill="F4F8F7"/>
+            <w:tcMar>
+              <w:top w:w="60" w:type="dxa"/>
+              <w:bottom w:w="60" w:type="dxa"/>
+              <w:left w:w="100" w:type="dxa"/>
+              <w:right w:w="100" w:type="dxa"/>
+            </w:tcMar>
+          </w:tcPr>
+          <w:p>
+            <w:r>
+              <w:rPr>
+                <w:b/>
+              </w:rPr>
+              <w:t>Funcionalidades Principais:</w:t>
+            </w:r>
+          </w:p>
+        </w:tc>
+        <w:tc>
+          <w:tcPr>
+            <w:tcW w:type="dxa" w:w="4709"/>
+            <w:shd w:fill="FFFFFF"/>
+            <w:tcMar>
+              <w:top w:w="60" w:type="dxa"/>
+              <w:bottom w:w="60" w:type="dxa"/>
+              <w:left w:w="100" w:type="dxa"/>
+              <w:right w:w="100" w:type="dxa"/>
+            </w:tcMar>
+          </w:tcPr>
+          <w:p>
+            <w:pPr>
+              <w:spacing w:after="40"/>
+            </w:pPr>
+            <w:r>
+              <w:t>• Gráfico vetorial interativo em SVG responsivo traçando as curvas de múltiplos sintomas simultaneamente.</w:t>
+            </w:r>
+          </w:p>
+          <w:p>
+            <w:pPr>
+              <w:spacing w:after="40"/>
+            </w:pPr>
+            <w:r>
+              <w:t>• Zona Crítica em vermelho (ESAS &gt;= 7) com linha pontilhada delimitando o limiar de alarme da equipe.</w:t>
+            </w:r>
+          </w:p>
+          <w:p>
+            <w:pPr>
+              <w:spacing w:after="40"/>
+            </w:pPr>
+            <w:r>
+              <w:t>• Painel de Resposta Terapêutica com cálculo automático de variação (delta) entre a última e a penúltima avaliação.</w:t>
+            </w:r>
+          </w:p>
+          <w:p>
+            <w:pPr>
+              <w:spacing w:after="40"/>
+            </w:pPr>
+            <w:r>
+              <w:t>• Indicadores semafóricos de melhora clínica (seta verde descendo), piora (seta vermelha subindo) ou estabilidade (=).</w:t>
+            </w:r>
+          </w:p>
+          <w:p>
+            <w:pPr>
+              <w:spacing w:after="40"/>
+            </w:pPr>
+            <w:r>
+              <w:t>• Integração perfeita aos temas Claro, Noturno (Escuro) e Alto Contraste AAA sem artefatos visuais.</w:t>
+            </w:r>
+          </w:p>
+        </w:tc>
+      </w:tr>
+      <w:tr>
+        <w:tc>
+          <w:tcPr>
+            <w:tcW w:type="dxa" w:w="4709"/>
+            <w:shd w:fill="F4F8F7"/>
+            <w:tcMar>
+              <w:top w:w="60" w:type="dxa"/>
+              <w:bottom w:w="60" w:type="dxa"/>
+              <w:left w:w="100" w:type="dxa"/>
+              <w:right w:w="100" w:type="dxa"/>
+            </w:tcMar>
+          </w:tcPr>
+          <w:p>
+            <w:r>
+              <w:rPr>
+                <w:b/>
+              </w:rPr>
+              <w:t>Fundamentos de IHC e Acessibilidade:</w:t>
+            </w:r>
+          </w:p>
+        </w:tc>
+        <w:tc>
+          <w:tcPr>
+            <w:tcW w:type="dxa" w:w="4709"/>
+            <w:shd w:fill="FFFFFF"/>
+            <w:tcMar>
+              <w:top w:w="60" w:type="dxa"/>
+              <w:bottom w:w="60" w:type="dxa"/>
+              <w:left w:w="100" w:type="dxa"/>
+              <w:right w:w="100" w:type="dxa"/>
+            </w:tcMar>
+          </w:tcPr>
+          <w:p>
+            <w:r>
+              <w:t>Ergonomia Cognitiva Médica e Heurística #1 (Visibilidade do estado): Transforma dados tabulares dispersos em uma representação gráfica unificada, reduzindo o tempo de interpretação médica para menos de 5 segundos.</w:t>
             </w:r>
           </w:p>
         </w:tc>

</xml_diff>